<commit_message>
Rebuild the report with the repository address
Co-Authored-By: Claude Opus 5.5 <noreply@anthropic.com>
</commit_message>
<xml_diff>
--- a/submission/final/InfraAgentKit_开源项目设计报告.docx
+++ b/submission/final/InfraAgentKit_开源项目设计报告.docx
@@ -7072,7 +7072,25 @@
           <w:color w:val="000000"/>
           <w:sz w:val="28"/>
         </w:rPr>
-        <w:t>代码仓库：源代码随本提交包提供；公开仓库地址在参赛单位完成开源审批后发布。</w:t>
+        <w:t>代码仓库：</w:t>
+      </w:r>
+      <w:r>
+        <w:rPr>
+          <w:rFonts w:ascii="Consolas" w:hAnsi="Consolas" w:hint="default" w:eastAsia="仿宋" w:cs="Consolas"/>
+          <w:b w:val="0"/>
+          <w:color w:val="000000"/>
+          <w:sz w:val="21"/>
+        </w:rPr>
+        <w:t>https://github.com/weareoneconnection/InfraAgentKit</w:t>
+      </w:r>
+      <w:r>
+        <w:rPr>
+          <w:rFonts w:ascii="Times New Roman" w:hAnsi="Times New Roman" w:hint="eastAsia" w:eastAsia="仿宋" w:cs="Times New Roman"/>
+          <w:b w:val="0"/>
+          <w:color w:val="000000"/>
+          <w:sz w:val="28"/>
+        </w:rPr>
+        <w:t>（公开），源代码同时随本提交包提供。</w:t>
       </w:r>
     </w:p>
     <w:p>

</xml_diff>

<commit_message>
docs: finalize competition evidence package
</commit_message>
<xml_diff>
--- a/submission/final/InfraAgentKit_开源项目设计报告.docx
+++ b/submission/final/InfraAgentKit_开源项目设计报告.docx
@@ -275,7 +275,7 @@
           <w:color w:val="000000"/>
           <w:sz w:val="28"/>
         </w:rPr>
-        <w:t xml:space="preserve">• </w:t>
+        <w:t>• 验证：35 项基准测试（含 11 项治理攻击）与 36 项单元和集成测试全部通过；MCP 服务已用官方客户端通过进程内和 stdio 两种方式实测。</w:t>
       </w:r>
       <w:r>
         <w:rPr>
@@ -284,7 +284,6 @@
           <w:color w:val="000000"/>
           <w:sz w:val="28"/>
         </w:rPr>
-        <w:t>验证</w:t>
       </w:r>
       <w:r>
         <w:rPr>
@@ -293,7 +292,6 @@
           <w:color w:val="000000"/>
           <w:sz w:val="28"/>
         </w:rPr>
-        <w:t>：35 项基准测试（含 11 项治理攻击）与 27 项单元和集成测试全部通过；MCP 服务已用官方客户端通过进程内和 stdio 两种方式实测。</w:t>
       </w:r>
     </w:p>
     <w:p>
@@ -4314,7 +4312,7 @@
                 <w:color w:val="000000"/>
                 <w:sz w:val="21"/>
               </w:rPr>
-              <w:t>27</w:t>
+              <w:t>36</w:t>
             </w:r>
           </w:p>
         </w:tc>
@@ -7054,7 +7052,7 @@
       <w:pPr>
         <w:spacing w:line="500" w:lineRule="exact" w:after="40"/>
         <w:ind w:left="835" w:hanging="403"/>
-        <w:jc w:val="both"/>
+        <w:jc w:val="left"/>
       </w:pPr>
       <w:r>
         <w:rPr>
@@ -8242,7 +8240,7 @@
                 <w:color w:val="000000"/>
                 <w:sz w:val="21"/>
               </w:rPr>
-              <w:t>第五章基准与 27 项测试</w:t>
+              <w:t>第五章基准与 36 项测试</w:t>
             </w:r>
           </w:p>
         </w:tc>
@@ -8545,7 +8543,7 @@
         <w:widowControl/>
         <w:spacing w:line="540" w:lineRule="exact" w:after="0"/>
         <w:ind w:firstLine="639"/>
-        <w:jc w:val="both"/>
+        <w:jc w:val="left"/>
       </w:pPr>
       <w:r>
         <w:rPr>
@@ -8554,7 +8552,7 @@
           <w:color w:val="000000"/>
           <w:sz w:val="30"/>
         </w:rPr>
-        <w:t>控制台与 API：</w:t>
+        <w:t>控制台与 API：infra-agent serve --port 8103，本地浏览器打开 http://127.0.0.1:8103。在线演示：https://infraagentkit-production.up.railway.app。Railway 生产环境使用独立的 /data 持久化卷。</w:t>
       </w:r>
       <w:r>
         <w:rPr>
@@ -8563,7 +8561,6 @@
           <w:color w:val="000000"/>
           <w:sz w:val="21"/>
         </w:rPr>
-        <w:t>infra-agent serve --port 8103</w:t>
       </w:r>
       <w:r>
         <w:rPr>
@@ -8572,7 +8569,6 @@
           <w:color w:val="000000"/>
           <w:sz w:val="30"/>
         </w:rPr>
-        <w:t xml:space="preserve">，浏览器打开 </w:t>
       </w:r>
       <w:r>
         <w:rPr>
@@ -8581,7 +8577,6 @@
           <w:color w:val="000000"/>
           <w:sz w:val="21"/>
         </w:rPr>
-        <w:t>http://127.0.0.1:8103</w:t>
       </w:r>
       <w:r>
         <w:rPr>
@@ -8590,7 +8585,6 @@
           <w:color w:val="000000"/>
           <w:sz w:val="30"/>
         </w:rPr>
-        <w:t>。</w:t>
       </w:r>
     </w:p>
     <w:p>
@@ -8648,6 +8642,7 @@
     </w:p>
     <w:sectPr>
       <w:footerReference r:id="rId5" w:type="default"/>
+      <w:headerReference w:type="default" r:id="rId12"/>
       <w:pgSz w:w="11906" w:h="16838"/>
       <w:pgMar w:top="1440" w:right="1633" w:bottom="1440" w:left="1587" w:header="851" w:footer="992" w:gutter="0"/>
       <w:pgNumType w:fmt="decimal" w:start="1"/>
@@ -8840,6 +8835,16 @@
     </w:p>
   </w:footnote>
 </w:footnotes>
+</file>
+
+<file path=word/header1.xml><?xml version="1.0" encoding="utf-8"?>
+<w:hdr xmlns:m="http://schemas.openxmlformats.org/officeDocument/2006/math" xmlns:mc="http://schemas.openxmlformats.org/markup-compatibility/2006" xmlns:mo="http://schemas.microsoft.com/office/mac/office/2008/main" xmlns:mv="urn:schemas-microsoft-com:mac:vml" xmlns:o="urn:schemas-microsoft-com:office:office" xmlns:r="http://schemas.openxmlformats.org/officeDocument/2006/relationships" xmlns:v="urn:schemas-microsoft-com:vml" xmlns:w10="urn:schemas-microsoft-com:office:word" xmlns:w14="http://schemas.microsoft.com/office/word/2010/wordml" xmlns:w="http://schemas.openxmlformats.org/wordprocessingml/2006/main" xmlns:wne="http://schemas.microsoft.com/office/word/2006/wordml" xmlns:wp14="http://schemas.microsoft.com/office/word/2010/wordprocessingDrawing" xmlns:wp="http://schemas.openxmlformats.org/drawingml/2006/wordprocessingDrawing" xmlns:wpc="http://schemas.microsoft.com/office/word/2010/wordprocessingCanvas" xmlns:wpg="http://schemas.microsoft.com/office/word/2010/wordprocessingGroup" xmlns:wpi="http://schemas.microsoft.com/office/word/2010/wordprocessingInk" xmlns:wps="http://schemas.microsoft.com/office/word/2010/wordprocessingShape" mc:Ignorable="w14 wp14">
+  <w:p>
+    <w:pPr>
+      <w:pStyle w:val="Header"/>
+    </w:pPr>
+  </w:p>
+</w:hdr>
 </file>
 
 <file path=word/styles.xml><?xml version="1.0" encoding="utf-8"?>

</xml_diff>